<commit_message>
Atualizado arquivo de Revisão
</commit_message>
<xml_diff>
--- a/Revisão.docx
+++ b/Revisão.docx
@@ -521,8 +521,176 @@
       <w:pPr>
         <w:jc w:val="both"/>
       </w:pPr>
-      <w:r>
-        <w:t>Associação</w:t>
+      <w:proofErr w:type="spellStart"/>
+      <w:r>
+        <w:t>Getters</w:t>
+      </w:r>
+      <w:proofErr w:type="spellEnd"/>
+      <w:r>
+        <w:t xml:space="preserve"> e </w:t>
+      </w:r>
+      <w:proofErr w:type="spellStart"/>
+      <w:r>
+        <w:t>Setters</w:t>
+      </w:r>
+      <w:proofErr w:type="spellEnd"/>
+      <w:r>
+        <w:t>:</w:t>
+      </w:r>
+    </w:p>
+    <w:p>
+      <w:pPr>
+        <w:jc w:val="both"/>
+      </w:pPr>
+      <w:r>
+        <w:tab/>
+        <w:t>Métodos de acesso</w:t>
+      </w:r>
+      <w:r>
+        <w:t xml:space="preserve"> das variáveis por meio de ações dentro da própria classe.</w:t>
+      </w:r>
+    </w:p>
+    <w:p>
+      <w:pPr>
+        <w:jc w:val="both"/>
+      </w:pPr>
+      <w:r>
+        <w:tab/>
+        <w:t xml:space="preserve">Set = </w:t>
+      </w:r>
+      <w:proofErr w:type="spellStart"/>
+      <w:r>
+        <w:t>void</w:t>
+      </w:r>
+      <w:proofErr w:type="spellEnd"/>
+    </w:p>
+    <w:p>
+      <w:pPr>
+        <w:jc w:val="both"/>
+      </w:pPr>
+      <w:r>
+        <w:tab/>
+      </w:r>
+      <w:proofErr w:type="spellStart"/>
+      <w:r>
+        <w:t>Get</w:t>
+      </w:r>
+      <w:proofErr w:type="spellEnd"/>
+      <w:r>
+        <w:t xml:space="preserve"> = nunca </w:t>
+      </w:r>
+      <w:proofErr w:type="spellStart"/>
+      <w:r>
+        <w:t>void</w:t>
+      </w:r>
+      <w:proofErr w:type="spellEnd"/>
+    </w:p>
+    <w:p>
+      <w:pPr>
+        <w:jc w:val="both"/>
+      </w:pPr>
+      <w:r>
+        <w:t>Associação:</w:t>
+      </w:r>
+    </w:p>
+    <w:p>
+      <w:pPr>
+        <w:jc w:val="both"/>
+      </w:pPr>
+      <w:r>
+        <w:tab/>
+      </w:r>
+      <w:r>
+        <w:t xml:space="preserve">Quando uma classe utiliza-se de </w:t>
+      </w:r>
+      <w:proofErr w:type="gramStart"/>
+      <w:r>
+        <w:t>outra(</w:t>
+      </w:r>
+      <w:proofErr w:type="gramEnd"/>
+      <w:r>
+        <w:t>exceto herança)</w:t>
+      </w:r>
+    </w:p>
+    <w:p>
+      <w:pPr>
+        <w:jc w:val="both"/>
+      </w:pPr>
+      <w:r>
+        <w:tab/>
+        <w:t>Uma classe instancia outra = Associação</w:t>
+      </w:r>
+    </w:p>
+    <w:p>
+      <w:pPr>
+        <w:jc w:val="both"/>
+      </w:pPr>
+      <w:r>
+        <w:tab/>
+        <w:t>Aparece no Diagrama de classe</w:t>
+      </w:r>
+    </w:p>
+    <w:p>
+      <w:pPr>
+        <w:jc w:val="both"/>
+      </w:pPr>
+      <w:r>
+        <w:tab/>
+        <w:t>Classe A e Classe B:</w:t>
+      </w:r>
+    </w:p>
+    <w:p>
+      <w:pPr>
+        <w:jc w:val="both"/>
+      </w:pPr>
+      <w:r>
+        <w:tab/>
+        <w:t>Classe A: new B (Associação)</w:t>
+      </w:r>
+    </w:p>
+    <w:p>
+      <w:pPr>
+        <w:jc w:val="both"/>
+      </w:pPr>
+      <w:r>
+        <w:tab/>
+      </w:r>
+      <w:proofErr w:type="gramStart"/>
+      <w:r>
+        <w:t>Cliente{</w:t>
+      </w:r>
+      <w:proofErr w:type="gramEnd"/>
+    </w:p>
+    <w:p>
+      <w:pPr>
+        <w:jc w:val="both"/>
+      </w:pPr>
+      <w:r>
+        <w:tab/>
+      </w:r>
+      <w:r>
+        <w:tab/>
+        <w:t xml:space="preserve">Private </w:t>
+      </w:r>
+      <w:r>
+        <w:t>Pessoa p;</w:t>
+      </w:r>
+    </w:p>
+    <w:p>
+      <w:pPr>
+        <w:jc w:val="both"/>
+      </w:pPr>
+      <w:r>
+        <w:tab/>
+        <w:t>}</w:t>
+      </w:r>
+    </w:p>
+    <w:p>
+      <w:pPr>
+        <w:jc w:val="both"/>
+      </w:pPr>
+      <w:r>
+        <w:tab/>
       </w:r>
       <w:bookmarkStart w:id="0" w:name="_GoBack"/>
       <w:bookmarkEnd w:id="0"/>

</xml_diff>